<commit_message>
Se Actualiza documento del curso,se agrega guía de GitHub y diapositivas de árboles
</commit_message>
<xml_diff>
--- a/ESTRUCTURA DE DATOS Y ALGORITMOS 2.docx
+++ b/ESTRUCTURA DE DATOS Y ALGORITMOS 2.docx
@@ -54,6 +54,7 @@
       </w:pPr>
       <w:r>
         <w:rPr>
+          <w:noProof/>
           <w:lang w:val="es-ES"/>
         </w:rPr>
         <w:drawing>
@@ -115,103 +116,33 @@
         <w:rPr>
           <w:lang w:val="es-ES"/>
         </w:rPr>
-        <w:t xml:space="preserve"> conjunto de </w:t>
-      </w:r>
-      <w:proofErr w:type="spellStart"/>
-      <w:r>
-        <w:rPr>
-          <w:lang w:val="es-ES"/>
-        </w:rPr>
-        <w:t>bagones</w:t>
-      </w:r>
-      <w:proofErr w:type="spellEnd"/>
-      <w:r>
-        <w:rPr>
-          <w:lang w:val="es-ES"/>
-        </w:rPr>
-        <w:t xml:space="preserve"> donde sabemos que hay una cabeza que es el primero y una cola que es el </w:t>
-      </w:r>
-      <w:proofErr w:type="spellStart"/>
-      <w:r>
-        <w:rPr>
-          <w:lang w:val="es-ES"/>
-        </w:rPr>
-        <w:t>ultimo</w:t>
-      </w:r>
-      <w:proofErr w:type="spellEnd"/>
-      <w:r>
-        <w:rPr>
-          <w:lang w:val="es-ES"/>
-        </w:rPr>
-        <w:t xml:space="preserve">. </w:t>
-      </w:r>
-    </w:p>
-    <w:p>
-      <w:pPr>
-        <w:rPr>
-          <w:lang w:val="es-ES"/>
-        </w:rPr>
-      </w:pPr>
-      <w:r>
-        <w:rPr>
-          <w:lang w:val="es-ES"/>
-        </w:rPr>
-        <w:t xml:space="preserve">Un </w:t>
-      </w:r>
-      <w:proofErr w:type="spellStart"/>
-      <w:r>
-        <w:rPr>
-          <w:lang w:val="es-ES"/>
-        </w:rPr>
-        <w:t>bagon</w:t>
-      </w:r>
-      <w:proofErr w:type="spellEnd"/>
-      <w:r>
-        <w:rPr>
-          <w:lang w:val="es-ES"/>
-        </w:rPr>
-        <w:t xml:space="preserve"> es un espacio o una caja donde guardo información y lo conecto con un siguiente </w:t>
-      </w:r>
-      <w:proofErr w:type="spellStart"/>
-      <w:r>
-        <w:rPr>
-          <w:lang w:val="es-ES"/>
-        </w:rPr>
-        <w:t>bagon</w:t>
-      </w:r>
-      <w:proofErr w:type="spellEnd"/>
-      <w:r>
-        <w:rPr>
-          <w:lang w:val="es-ES"/>
-        </w:rPr>
-        <w:t>.</w:t>
-      </w:r>
-    </w:p>
-    <w:p>
-      <w:pPr>
-        <w:rPr>
-          <w:lang w:val="es-ES"/>
-        </w:rPr>
-      </w:pPr>
-      <w:r>
-        <w:rPr>
-          <w:lang w:val="es-ES"/>
-        </w:rPr>
-        <w:t xml:space="preserve">El </w:t>
-      </w:r>
-      <w:proofErr w:type="spellStart"/>
-      <w:r>
-        <w:rPr>
-          <w:lang w:val="es-ES"/>
-        </w:rPr>
-        <w:t>bagon</w:t>
-      </w:r>
-      <w:proofErr w:type="spellEnd"/>
-      <w:r>
-        <w:rPr>
-          <w:lang w:val="es-ES"/>
-        </w:rPr>
-        <w:t xml:space="preserve"> se </w:t>
+        <w:t xml:space="preserve"> conjunto de bagones donde sabemos que hay una cabeza que es el primero y una cola que es el ultimo. </w:t>
+      </w:r>
+    </w:p>
+    <w:p>
+      <w:pPr>
+        <w:rPr>
+          <w:lang w:val="es-ES"/>
+        </w:rPr>
+      </w:pPr>
+      <w:r>
+        <w:rPr>
+          <w:lang w:val="es-ES"/>
+        </w:rPr>
+        <w:t>Un bagon es un espacio o una caja donde guardo información y lo conecto con un siguiente bagon.</w:t>
+      </w:r>
+    </w:p>
+    <w:p>
+      <w:pPr>
+        <w:rPr>
+          <w:lang w:val="es-ES"/>
+        </w:rPr>
+      </w:pPr>
+      <w:r>
+        <w:rPr>
+          <w:lang w:val="es-ES"/>
+        </w:rPr>
+        <w:t xml:space="preserve">El bagon se </w:t>
       </w:r>
       <w:proofErr w:type="gramStart"/>
       <w:r>
@@ -244,31 +175,18 @@
         <w:rPr>
           <w:lang w:val="es-ES"/>
         </w:rPr>
-        <w:t xml:space="preserve">El tren es la lista y tiene Cabeza que es el primero, Cola el ultimo Y cantidad de </w:t>
-      </w:r>
-      <w:proofErr w:type="spellStart"/>
-      <w:r>
-        <w:rPr>
-          <w:lang w:val="es-ES"/>
-        </w:rPr>
-        <w:t>bagones</w:t>
-      </w:r>
-      <w:proofErr w:type="spellEnd"/>
-      <w:r>
-        <w:rPr>
-          <w:lang w:val="es-ES"/>
-        </w:rPr>
-        <w:t xml:space="preserve"> </w:t>
-      </w:r>
-    </w:p>
-    <w:p>
-      <w:pPr>
-        <w:rPr>
-          <w:lang w:val="es-ES"/>
-        </w:rPr>
-      </w:pPr>
-      <w:r>
-        <w:rPr>
+        <w:t xml:space="preserve">El tren es la lista y tiene Cabeza que es el primero, Cola el ultimo Y cantidad de bagones </w:t>
+      </w:r>
+    </w:p>
+    <w:p>
+      <w:pPr>
+        <w:rPr>
+          <w:lang w:val="es-ES"/>
+        </w:rPr>
+      </w:pPr>
+      <w:r>
+        <w:rPr>
+          <w:noProof/>
           <w:lang w:val="es-ES"/>
         </w:rPr>
         <w:drawing>
@@ -329,6 +247,7 @@
       </w:pPr>
       <w:r>
         <w:rPr>
+          <w:noProof/>
           <w:lang w:val="es-ES"/>
         </w:rPr>
         <w:lastRenderedPageBreak/>
@@ -377,6 +296,7 @@
       </w:pPr>
       <w:r>
         <w:rPr>
+          <w:noProof/>
           <w:lang w:val="es-ES"/>
         </w:rPr>
         <w:drawing>
@@ -437,6 +357,7 @@
       </w:pPr>
       <w:r>
         <w:rPr>
+          <w:noProof/>
           <w:lang w:val="es-ES"/>
         </w:rPr>
         <w:drawing>
@@ -484,6 +405,7 @@
       </w:pPr>
       <w:r>
         <w:rPr>
+          <w:noProof/>
           <w:lang w:val="es-ES"/>
         </w:rPr>
         <w:lastRenderedPageBreak/>
@@ -532,6 +454,7 @@
       </w:pPr>
       <w:r>
         <w:rPr>
+          <w:noProof/>
           <w:lang w:val="es-ES"/>
         </w:rPr>
         <w:drawing>
@@ -579,6 +502,7 @@
       </w:pPr>
       <w:r>
         <w:rPr>
+          <w:noProof/>
           <w:lang w:val="es-ES"/>
         </w:rPr>
         <w:lastRenderedPageBreak/>
@@ -627,6 +551,7 @@
       </w:pPr>
       <w:r>
         <w:rPr>
+          <w:noProof/>
           <w:lang w:val="es-ES"/>
         </w:rPr>
         <w:drawing>
@@ -674,6 +599,7 @@
       </w:pPr>
       <w:r>
         <w:rPr>
+          <w:noProof/>
           <w:lang w:val="es-ES"/>
         </w:rPr>
         <w:drawing>
@@ -735,6 +661,7 @@
       </w:pPr>
       <w:r>
         <w:rPr>
+          <w:noProof/>
           <w:lang w:val="es-ES"/>
         </w:rPr>
         <w:drawing>
@@ -782,6 +709,7 @@
       </w:pPr>
       <w:r>
         <w:rPr>
+          <w:noProof/>
           <w:lang w:val="es-ES"/>
         </w:rPr>
         <w:drawing>
@@ -829,6 +757,7 @@
       </w:pPr>
       <w:r>
         <w:rPr>
+          <w:noProof/>
           <w:lang w:val="es-ES"/>
         </w:rPr>
         <w:drawing>
@@ -876,6 +805,7 @@
       </w:pPr>
       <w:r>
         <w:rPr>
+          <w:noProof/>
           <w:lang w:val="es-ES"/>
         </w:rPr>
         <w:lastRenderedPageBreak/>
@@ -924,6 +854,7 @@
       </w:pPr>
       <w:r>
         <w:rPr>
+          <w:noProof/>
           <w:lang w:val="es-ES"/>
         </w:rPr>
         <w:drawing>
@@ -971,6 +902,7 @@
       </w:pPr>
       <w:r>
         <w:rPr>
+          <w:noProof/>
           <w:lang w:val="es-ES"/>
         </w:rPr>
         <w:drawing>
@@ -1018,6 +950,7 @@
       </w:pPr>
       <w:r>
         <w:rPr>
+          <w:noProof/>
           <w:lang w:val="es-ES"/>
         </w:rPr>
         <w:lastRenderedPageBreak/>
@@ -1066,6 +999,7 @@
       </w:pPr>
       <w:r>
         <w:rPr>
+          <w:noProof/>
           <w:lang w:val="es-ES"/>
         </w:rPr>
         <w:drawing>
@@ -1113,6 +1047,7 @@
       </w:pPr>
       <w:r>
         <w:rPr>
+          <w:noProof/>
           <w:lang w:val="es-ES"/>
         </w:rPr>
         <w:drawing>
@@ -1165,6 +1100,245 @@
           <w:lang w:val="es-ES"/>
         </w:rPr>
       </w:pPr>
+      <w:r>
+        <w:rPr>
+          <w:lang w:val="es-ES"/>
+        </w:rPr>
+        <w:lastRenderedPageBreak/>
+        <w:t>25-09-2026</w:t>
+      </w:r>
+    </w:p>
+    <w:p>
+      <w:r>
+        <w:t xml:space="preserve">En esta reunión el profesor habló de varias </w:t>
+      </w:r>
+      <w:r>
+        <w:rPr>
+          <w:b/>
+          <w:bCs/>
+        </w:rPr>
+        <w:t>listas como estructuras de datos</w:t>
+      </w:r>
+      <w:r>
+        <w:t xml:space="preserve"> y las conectó con los árboles:</w:t>
+      </w:r>
+    </w:p>
+    <w:p>
+      <w:pPr>
+        <w:numPr>
+          <w:ilvl w:val="0"/>
+          <w:numId w:val="2"/>
+        </w:numPr>
+      </w:pPr>
+      <w:r>
+        <w:rPr>
+          <w:b/>
+          <w:bCs/>
+        </w:rPr>
+        <w:t>Listas enlazadas (</w:t>
+      </w:r>
+      <w:proofErr w:type="gramStart"/>
+      <w:r>
+        <w:rPr>
+          <w:b/>
+          <w:bCs/>
+        </w:rPr>
+        <w:t>simples)</w:t>
+      </w:r>
+      <w:r>
+        <w:t>  1</w:t>
+      </w:r>
+      <w:proofErr w:type="gramEnd"/>
+      <w:r>
+        <w:t xml:space="preserve">  </w:t>
+      </w:r>
+    </w:p>
+    <w:p>
+      <w:pPr>
+        <w:numPr>
+          <w:ilvl w:val="1"/>
+          <w:numId w:val="2"/>
+        </w:numPr>
+      </w:pPr>
+      <w:r>
+        <w:t>Cada nodo tiene un valor y una referencia ("siguiente") a un único nodo posterior.</w:t>
+      </w:r>
+    </w:p>
+    <w:p>
+      <w:pPr>
+        <w:numPr>
+          <w:ilvl w:val="1"/>
+          <w:numId w:val="2"/>
+        </w:numPr>
+      </w:pPr>
+      <w:r>
+        <w:t>Forman una cadena lineal de nodos, ideal para recorrer de inicio a fin y para insertar/eliminar elementos sin mover todo como en un arreglo.</w:t>
+      </w:r>
+    </w:p>
+    <w:p>
+      <w:pPr>
+        <w:numPr>
+          <w:ilvl w:val="0"/>
+          <w:numId w:val="2"/>
+        </w:numPr>
+      </w:pPr>
+      <w:r>
+        <w:rPr>
+          <w:b/>
+          <w:bCs/>
+        </w:rPr>
+        <w:t xml:space="preserve">Listas doblemente </w:t>
+      </w:r>
+      <w:proofErr w:type="gramStart"/>
+      <w:r>
+        <w:rPr>
+          <w:b/>
+          <w:bCs/>
+        </w:rPr>
+        <w:t>enlazadas</w:t>
+      </w:r>
+      <w:r>
+        <w:t>  1</w:t>
+      </w:r>
+      <w:proofErr w:type="gramEnd"/>
+      <w:r>
+        <w:t xml:space="preserve">  </w:t>
+      </w:r>
+    </w:p>
+    <w:p>
+      <w:pPr>
+        <w:numPr>
+          <w:ilvl w:val="1"/>
+          <w:numId w:val="2"/>
+        </w:numPr>
+      </w:pPr>
+      <w:r>
+        <w:t>Cada nodo tiene referencias tanto al siguiente como al anterior.</w:t>
+      </w:r>
+    </w:p>
+    <w:p>
+      <w:pPr>
+        <w:numPr>
+          <w:ilvl w:val="1"/>
+          <w:numId w:val="2"/>
+        </w:numPr>
+      </w:pPr>
+      <w:r>
+        <w:t>Permiten recorrer en ambos sentidos (adelante y atrás) y facilitan operaciones como eliminar o insertar en medio manteniendo enlaces en las dos direcciones.</w:t>
+      </w:r>
+    </w:p>
+    <w:p>
+      <w:pPr>
+        <w:numPr>
+          <w:ilvl w:val="0"/>
+          <w:numId w:val="2"/>
+        </w:numPr>
+      </w:pPr>
+      <w:r>
+        <w:rPr>
+          <w:b/>
+          <w:bCs/>
+        </w:rPr>
+        <w:t xml:space="preserve">Listas </w:t>
+      </w:r>
+      <w:proofErr w:type="gramStart"/>
+      <w:r>
+        <w:rPr>
+          <w:b/>
+          <w:bCs/>
+        </w:rPr>
+        <w:t>circulares</w:t>
+      </w:r>
+      <w:r>
+        <w:t>  1</w:t>
+      </w:r>
+      <w:proofErr w:type="gramEnd"/>
+      <w:r>
+        <w:t xml:space="preserve">  </w:t>
+      </w:r>
+    </w:p>
+    <w:p>
+      <w:pPr>
+        <w:numPr>
+          <w:ilvl w:val="1"/>
+          <w:numId w:val="2"/>
+        </w:numPr>
+      </w:pPr>
+      <w:r>
+        <w:t>En vez de terminar en null, el último nodo apunta nuevamente al primero.</w:t>
+      </w:r>
+    </w:p>
+    <w:p>
+      <w:pPr>
+        <w:numPr>
+          <w:ilvl w:val="1"/>
+          <w:numId w:val="2"/>
+        </w:numPr>
+      </w:pPr>
+      <w:r>
+        <w:t>Útiles cuando se necesita un recorrido cíclico continuo (por ejemplo, procesos que se repiten en ciclo) sin tener que reiniciar manualmente en el inicio.</w:t>
+      </w:r>
+    </w:p>
+    <w:p>
+      <w:pPr>
+        <w:numPr>
+          <w:ilvl w:val="0"/>
+          <w:numId w:val="2"/>
+        </w:numPr>
+      </w:pPr>
+      <w:r>
+        <w:rPr>
+          <w:b/>
+          <w:bCs/>
+        </w:rPr>
+        <w:t xml:space="preserve">Listas circulares doblemente </w:t>
+      </w:r>
+      <w:proofErr w:type="gramStart"/>
+      <w:r>
+        <w:rPr>
+          <w:b/>
+          <w:bCs/>
+        </w:rPr>
+        <w:t>enlazadas</w:t>
+      </w:r>
+      <w:r>
+        <w:t>  1</w:t>
+      </w:r>
+      <w:proofErr w:type="gramEnd"/>
+      <w:r>
+        <w:t xml:space="preserve">  </w:t>
+      </w:r>
+    </w:p>
+    <w:p>
+      <w:pPr>
+        <w:numPr>
+          <w:ilvl w:val="1"/>
+          <w:numId w:val="2"/>
+        </w:numPr>
+      </w:pPr>
+      <w:r>
+        <w:t>Combinan la doble referencia (anterior y siguiente) con la característica circular.</w:t>
+      </w:r>
+    </w:p>
+    <w:p>
+      <w:pPr>
+        <w:numPr>
+          <w:ilvl w:val="1"/>
+          <w:numId w:val="2"/>
+        </w:numPr>
+      </w:pPr>
+      <w:r>
+        <w:t>Permiten moverse hacia adelante y hacia atrás en un ciclo cerrado, útil para navegaciones circulares (menús, turnos, etc.).</w:t>
+      </w:r>
+    </w:p>
+    <w:p/>
+    <w:p/>
+    <w:p>
+      <w:pPr>
+        <w:rPr>
+          <w:lang w:val="es-ES"/>
+        </w:rPr>
+      </w:pPr>
     </w:p>
     <w:p>
       <w:pPr>
@@ -1186,6 +1360,123 @@
 <file path=word/numbering.xml><?xml version="1.0" encoding="utf-8"?>
 <w:numbering xmlns:wpc="http://schemas.microsoft.com/office/word/2010/wordprocessingCanvas" xmlns:cx="http://schemas.microsoft.com/office/drawing/2014/chartex" xmlns:cx1="http://schemas.microsoft.com/office/drawing/2015/9/8/chartex" xmlns:cx2="http://schemas.microsoft.com/office/drawing/2015/10/21/chartex" xmlns:cx3="http://schemas.microsoft.com/office/drawing/2016/5/9/chartex" xmlns:cx4="http://schemas.microsoft.com/office/drawing/2016/5/10/chartex" xmlns:cx5="http://schemas.microsoft.com/office/drawing/2016/5/11/chartex" xmlns:cx6="http://schemas.microsoft.com/office/drawing/2016/5/12/chartex" xmlns:cx7="http://schemas.microsoft.com/office/drawing/2016/5/13/chartex" xmlns:cx8="http://schemas.microsoft.com/office/drawing/2016/5/14/chartex" xmlns:mc="http://schemas.openxmlformats.org/markup-compatibility/2006" xmlns:aink="http://schemas.microsoft.com/office/drawing/2016/ink" xmlns:am3d="http://schemas.microsoft.com/office/drawing/2017/model3d" xmlns:o="urn:schemas-microsoft-com:office:office" xmlns:oel="http://schemas.microsoft.com/office/2019/extlst" xmlns:r="http://schemas.openxmlformats.org/officeDocument/2006/relationships" xmlns:m="http://schemas.openxmlformats.org/officeDocument/2006/math" xmlns:v="urn:schemas-microsoft-com:vml" xmlns:wp14="http://schemas.microsoft.com/office/word/2010/wordprocessingDrawing" xmlns:wp="http://schemas.openxmlformats.org/drawingml/2006/wordprocessingDrawing" xmlns:w10="urn:schemas-microsoft-com:office:word" xmlns:w="http://schemas.openxmlformats.org/wordprocessingml/2006/main" xmlns:w14="http://schemas.microsoft.com/office/word/2010/wordml" xmlns:w15="http://schemas.microsoft.com/office/word/2012/wordml" xmlns:w16cex="http://schemas.microsoft.com/office/word/2018/wordml/cex" xmlns:w16cid="http://schemas.microsoft.com/office/word/2016/wordml/cid" xmlns:w16="http://schemas.microsoft.com/office/word/2018/wordml" xmlns:w16du="http://schemas.microsoft.com/office/word/2023/wordml/word16du" xmlns:w16sdtdh="http://schemas.microsoft.com/office/word/2020/wordml/sdtdatahash" xmlns:w16sdtfl="http://schemas.microsoft.com/office/word/2024/wordml/sdtformatlock" xmlns:w16se="http://schemas.microsoft.com/office/word/2015/wordml/symex" xmlns:wpg="http://schemas.microsoft.com/office/word/2010/wordprocessingGroup" xmlns:wpi="http://schemas.microsoft.com/office/word/2010/wordprocessingInk" xmlns:wne="http://schemas.microsoft.com/office/word/2006/wordml" xmlns:wps="http://schemas.microsoft.com/office/word/2010/wordprocessingShape" mc:Ignorable="w14 w15 w16se w16cid w16 w16cex w16sdtdh w16sdtfl w16du wp14">
   <w:abstractNum w:abstractNumId="0" w15:restartNumberingAfterBreak="0">
+    <w:nsid w:val="2C5875BA"/>
+    <w:multiLevelType w:val="multilevel"/>
+    <w:tmpl w:val="7DFCA44A"/>
+    <w:lvl w:ilvl="0">
+      <w:start w:val="1"/>
+      <w:numFmt w:val="decimal"/>
+      <w:lvlText w:val="%1."/>
+      <w:lvlJc w:val="left"/>
+      <w:pPr>
+        <w:tabs>
+          <w:tab w:val="num" w:pos="720"/>
+        </w:tabs>
+        <w:ind w:left="720" w:hanging="360"/>
+      </w:pPr>
+    </w:lvl>
+    <w:lvl w:ilvl="1">
+      <w:start w:val="1"/>
+      <w:numFmt w:val="bullet"/>
+      <w:lvlText w:val="o"/>
+      <w:lvlJc w:val="left"/>
+      <w:pPr>
+        <w:tabs>
+          <w:tab w:val="num" w:pos="1440"/>
+        </w:tabs>
+        <w:ind w:left="1440" w:hanging="360"/>
+      </w:pPr>
+      <w:rPr>
+        <w:rFonts w:ascii="Courier New" w:hAnsi="Courier New" w:hint="default"/>
+        <w:sz w:val="20"/>
+      </w:rPr>
+    </w:lvl>
+    <w:lvl w:ilvl="2" w:tentative="1">
+      <w:start w:val="1"/>
+      <w:numFmt w:val="decimal"/>
+      <w:lvlText w:val="%3."/>
+      <w:lvlJc w:val="left"/>
+      <w:pPr>
+        <w:tabs>
+          <w:tab w:val="num" w:pos="2160"/>
+        </w:tabs>
+        <w:ind w:left="2160" w:hanging="360"/>
+      </w:pPr>
+    </w:lvl>
+    <w:lvl w:ilvl="3" w:tentative="1">
+      <w:start w:val="1"/>
+      <w:numFmt w:val="decimal"/>
+      <w:lvlText w:val="%4."/>
+      <w:lvlJc w:val="left"/>
+      <w:pPr>
+        <w:tabs>
+          <w:tab w:val="num" w:pos="2880"/>
+        </w:tabs>
+        <w:ind w:left="2880" w:hanging="360"/>
+      </w:pPr>
+    </w:lvl>
+    <w:lvl w:ilvl="4" w:tentative="1">
+      <w:start w:val="1"/>
+      <w:numFmt w:val="decimal"/>
+      <w:lvlText w:val="%5."/>
+      <w:lvlJc w:val="left"/>
+      <w:pPr>
+        <w:tabs>
+          <w:tab w:val="num" w:pos="3600"/>
+        </w:tabs>
+        <w:ind w:left="3600" w:hanging="360"/>
+      </w:pPr>
+    </w:lvl>
+    <w:lvl w:ilvl="5" w:tentative="1">
+      <w:start w:val="1"/>
+      <w:numFmt w:val="decimal"/>
+      <w:lvlText w:val="%6."/>
+      <w:lvlJc w:val="left"/>
+      <w:pPr>
+        <w:tabs>
+          <w:tab w:val="num" w:pos="4320"/>
+        </w:tabs>
+        <w:ind w:left="4320" w:hanging="360"/>
+      </w:pPr>
+    </w:lvl>
+    <w:lvl w:ilvl="6" w:tentative="1">
+      <w:start w:val="1"/>
+      <w:numFmt w:val="decimal"/>
+      <w:lvlText w:val="%7."/>
+      <w:lvlJc w:val="left"/>
+      <w:pPr>
+        <w:tabs>
+          <w:tab w:val="num" w:pos="5040"/>
+        </w:tabs>
+        <w:ind w:left="5040" w:hanging="360"/>
+      </w:pPr>
+    </w:lvl>
+    <w:lvl w:ilvl="7" w:tentative="1">
+      <w:start w:val="1"/>
+      <w:numFmt w:val="decimal"/>
+      <w:lvlText w:val="%8."/>
+      <w:lvlJc w:val="left"/>
+      <w:pPr>
+        <w:tabs>
+          <w:tab w:val="num" w:pos="5760"/>
+        </w:tabs>
+        <w:ind w:left="5760" w:hanging="360"/>
+      </w:pPr>
+    </w:lvl>
+    <w:lvl w:ilvl="8" w:tentative="1">
+      <w:start w:val="1"/>
+      <w:numFmt w:val="decimal"/>
+      <w:lvlText w:val="%9."/>
+      <w:lvlJc w:val="left"/>
+      <w:pPr>
+        <w:tabs>
+          <w:tab w:val="num" w:pos="6480"/>
+        </w:tabs>
+        <w:ind w:left="6480" w:hanging="360"/>
+      </w:pPr>
+    </w:lvl>
+  </w:abstractNum>
+  <w:abstractNum w:abstractNumId="1" w15:restartNumberingAfterBreak="0">
     <w:nsid w:val="61F24DD8"/>
     <w:multiLevelType w:val="hybridMultilevel"/>
     <w:tmpl w:val="4832073A"/>
@@ -1275,6 +1566,9 @@
     </w:lvl>
   </w:abstractNum>
   <w:num w:numId="1" w16cid:durableId="1678776265">
+    <w:abstractNumId w:val="1"/>
+  </w:num>
+  <w:num w:numId="2" w16cid:durableId="718358761">
     <w:abstractNumId w:val="0"/>
   </w:num>
 </w:numbering>
@@ -1883,7 +2177,6 @@
   <w:style w:type="character" w:default="1" w:styleId="Fuentedeprrafopredeter">
     <w:name w:val="Default Paragraph Font"/>
     <w:uiPriority w:val="1"/>
-    <w:semiHidden/>
     <w:unhideWhenUsed/>
   </w:style>
   <w:style w:type="table" w:default="1" w:styleId="Tablanormal">

</xml_diff>